<commit_message>
docs: clarify E3 matrix-sensitive robustness finding
Replaces only the E3 caveat with the author-approved interpretation: nominal evidence under the alternative KNN and distance-band matrices after the great-circle correction, no replication under the prespecified Queen matrix or its wild-cluster bootstrap, primary conclusion unchanged, classified as a matrix-sensitive robustness finding. No numerical result changed; the docx keeps its committed images.

Co-Authored-By: Claude Opus 5.5 <noreply@anthropic.com>
Claude-Session: https://claude.ai/code/session_018UrGXNju7FcDZFSEZjyU6P
</commit_message>
<xml_diff>
--- a/paper.docx
+++ b/paper.docx
@@ -4565,25 +4565,25 @@
         <w:t xml:space="preserve"> </w:t>
       </w:r>
       <w:r>
-        <w:t xml:space="preserve">No robust event-conditioned parameter instability is found. One</w:t>
-      </w:r>
-      <w:r>
-        <w:t xml:space="preserve"> </w:t>
-      </w:r>
-      <w:r>
-        <w:t xml:space="preserve">qualification: in the weight-robustness check (Stage 16, Section J;</w:t>
-      </w:r>
-      <w:r>
-        <w:t xml:space="preserve"> </w:t>
-      </w:r>
-      <w:r>
-        <w:t xml:space="preserve">Driscoll-Kraay asymptotic p-values, no bootstrap), the spatial-dynamics</w:t>
-      </w:r>
-      <w:r>
-        <w:t xml:space="preserve"> </w:t>
-      </w:r>
-      <w:r>
-        <w:t xml:space="preserve">test for the July 2020 VAT increase is nominally significant under KNN</w:t>
+        <w:t xml:space="preserve">No robust event-conditioned parameter instability is found. A</w:t>
+      </w:r>
+      <w:r>
+        <w:t xml:space="preserve"> </w:t>
+      </w:r>
+      <w:r>
+        <w:t xml:space="preserve">post-audit sensitivity check using geographically corrected great-circle</w:t>
+      </w:r>
+      <w:r>
+        <w:t xml:space="preserve"> </w:t>
+      </w:r>
+      <w:r>
+        <w:t xml:space="preserve">distance weights produced nominal evidence of spatial dynamics for the</w:t>
+      </w:r>
+      <w:r>
+        <w:t xml:space="preserve"> </w:t>
+      </w:r>
+      <w:r>
+        <w:t xml:space="preserve">July 2020 event under the alternative KNN</w:t>
       </w:r>
       <w:r>
         <w:t xml:space="preserve"> </w:t>
@@ -4595,37 +4595,67 @@
         <w:t xml:space="preserve"> </w:t>
       </w:r>
       <w:r>
-        <w:t xml:space="preserve">and distance-band weights</w:t>
-      </w:r>
-      <w:r>
-        <w:t xml:space="preserve"> </w:t>
-      </w:r>
-      <w:r>
-        <w:t xml:space="preserve">(p &lt; 0.001),</w:t>
-      </w:r>
-      <w:r>
-        <w:t xml:space="preserve"> </w:t>
-      </w:r>
-      <w:r>
-        <w:t xml:space="preserve">but not under the primary Queen weights</w:t>
-      </w:r>
-      <w:r>
-        <w:t xml:space="preserve"> </w:t>
-      </w:r>
-      <w:r>
-        <w:t xml:space="preserve">(p = 0.14).</w:t>
-      </w:r>
-      <w:r>
-        <w:t xml:space="preserve"> </w:t>
-      </w:r>
-      <w:r>
-        <w:t xml:space="preserve">This episode overlaps the COVID-19 period, and the result is not part of</w:t>
-      </w:r>
-      <w:r>
-        <w:t xml:space="preserve"> </w:t>
-      </w:r>
-      <w:r>
-        <w:t xml:space="preserve">the pre-specified corrected family above.</w:t>
+        <w:t xml:space="preserve">and distance-band</w:t>
+      </w:r>
+      <w:r>
+        <w:t xml:space="preserve"> </w:t>
+      </w:r>
+      <w:r>
+        <w:t xml:space="preserve">(p &lt; 0.001)</w:t>
+      </w:r>
+      <w:r>
+        <w:t xml:space="preserve"> </w:t>
+      </w:r>
+      <w:r>
+        <w:t xml:space="preserve">matrices (Stage 16, Section J; Driscoll-Kraay asymptotic p-values). This</w:t>
+      </w:r>
+      <w:r>
+        <w:t xml:space="preserve"> </w:t>
+      </w:r>
+      <w:r>
+        <w:t xml:space="preserve">pattern does not replicate under the prespecified primary Queen matrix</w:t>
+      </w:r>
+      <w:r>
+        <w:t xml:space="preserve"> </w:t>
+      </w:r>
+      <w:r>
+        <w:t xml:space="preserve">(p = 0.14)</w:t>
+      </w:r>
+      <w:r>
+        <w:t xml:space="preserve"> </w:t>
+      </w:r>
+      <w:r>
+        <w:t xml:space="preserve">or its wild-cluster bootstrap inference</w:t>
+      </w:r>
+      <w:r>
+        <w:t xml:space="preserve"> </w:t>
+      </w:r>
+      <w:r>
+        <w:t xml:space="preserve">(p = 0.65, B = 9999)</w:t>
+      </w:r>
+      <w:r>
+        <w:t xml:space="preserve"> </w:t>
+      </w:r>
+      <w:r>
+        <w:t xml:space="preserve">and therefore does not alter the study’s primary conclusion. Given the</w:t>
+      </w:r>
+      <w:r>
+        <w:t xml:space="preserve"> </w:t>
+      </w:r>
+      <w:r>
+        <w:t xml:space="preserve">event’s overlap with the COVID-19 period, the result is treated as a</w:t>
+      </w:r>
+      <w:r>
+        <w:t xml:space="preserve"> </w:t>
+      </w:r>
+      <w:r>
+        <w:t xml:space="preserve">matrix-sensitive robustness finding rather than independent evidence of a</w:t>
+      </w:r>
+      <w:r>
+        <w:t xml:space="preserve"> </w:t>
+      </w:r>
+      <w:r>
+        <w:t xml:space="preserve">spatial VAT effect.</w:t>
       </w:r>
     </w:p>
     <w:bookmarkEnd w:id="34"/>

</xml_diff>